<commit_message>
Audit and revise readability article: fix grade-drop maths, add AI, layout and Word sections, replace redundant FAQs
Co-Authored-By: Claude Opus 5.5 <noreply@anthropic.com>
Claude-Session: https://claude.ai/code/session_01GQXcnZLn4f9MkUS7SEqp5J
</commit_message>
<xml_diff>
--- a/blog-content/How-To-Improve-Blog-Readability-Score.docx
+++ b/blog-content/How-To-Improve-Blog-Readability-Score.docx
@@ -15,7 +15,7 @@
           <w:sz w:val="18"/>
           <w:szCs w:val="18"/>
         </w:rPr>
-        <w:t xml:space="preserve">BLOG POST: How to Improve Your Blog Readability Score in 2026 (I Tested It) | BrightlyFuture.co.uk | URL: /blog/how-to-improve-blog-readability-score/ | Meta Description: Improve your blog readability score with a tested 5-pass edit. My paragraph went from -12 to 79 on Flesch. Free checker, real data from 11 ranking posts. | Primary Keyword: improve blog readability score</w:t>
+        <w:t xml:space="preserve">BLOG POST: How to Improve Your Blog Readability Score in 2026 (I Tested It) | BrightlyFuture.co.uk | URL: /blog/how-to-improve-blog-readability-score/ | Meta Description: Improve your blog readability score with a tested 5-pass edit. One paragraph went from -12 to 79 on Flesch. Free checker + data from 11 ranking posts. | Primary Keyword: improve blog readability score</w:t>
       </w:r>
     </w:p>
     <w:p>
@@ -65,7 +65,7 @@
           <w:sz w:val="24"/>
           <w:szCs w:val="24"/>
         </w:rPr>
-        <w:t xml:space="preserve"> To improve your blog readability score, cut sentences to under 20 words, swap long words for short ones, write in active voice and break paragraphs into 2–4 sentences. Aim for 60–70 on the Flesch Reading Ease scale. My test paragraph went from −12 to 79 without losing a single fact.</w:t>
+        <w:t xml:space="preserve"> To improve your blog readability score, keep average sentence length under 20 words, swap three-syllable words for short ones, and write in active voice. Aim for 60–70 on the Flesch Reading Ease scale. In my test, one paragraph jumped from −12 to 79 without losing a fact.</w:t>
       </w:r>
     </w:p>
     <w:p>
@@ -137,23 +137,23 @@
           <w:sz w:val="24"/>
           <w:szCs w:val="24"/>
         </w:rPr>
-        <w:t xml:space="preserve">I scored the 11 top-ranking articles on this exact topic before writing this one. Only three of them hit the 60–70 target they tell you to aim for. The rest landed between 53 and 59.</w:t>
-      </w:r>
-    </w:p>
-    <w:p>
-      <w:pPr>
-        <w:spacing w:after="160"/>
-      </w:pPr>
-      <w:r>
-        <w:rPr>
-          <w:rFonts w:ascii="Calibri" w:cs="Calibri" w:eastAsia="Calibri" w:hAnsi="Calibri"/>
-          <w:color w:val="333333"/>
-          <w:sz w:val="24"/>
-          <w:szCs w:val="24"/>
-        </w:rPr>
-        <w:t xml:space="preserve">That result shaped this guide. Most advice on how to improve blog readability score repeats the same eight tips, then never proves they work. Below you get my own before-and-after test, the numbers from the ranking pages, the one trap that makes scores lie, and a </w:t>
-      </w:r>
-      <w:hyperlink w:history="1" r:id="rIdteiubklo_jex-zm8f9pbo">
+        <w:t xml:space="preserve">Before writing this guide, I scored the 11 top-ranking articles on this exact topic. Only three of them hit the 60–70 target they tell you to aim for. The rest landed between 53 and 59.</w:t>
+      </w:r>
+    </w:p>
+    <w:p>
+      <w:pPr>
+        <w:spacing w:after="160"/>
+      </w:pPr>
+      <w:r>
+        <w:rPr>
+          <w:rFonts w:ascii="Calibri" w:cs="Calibri" w:eastAsia="Calibri" w:hAnsi="Calibri"/>
+          <w:color w:val="333333"/>
+          <w:sz w:val="24"/>
+          <w:szCs w:val="24"/>
+        </w:rPr>
+        <w:t xml:space="preserve">That result shaped everything below. Most advice on how to improve blog readability score repeats the same eight tips and never proves they work. You get my own before-and-after test, the scores of the pages that rank, the trap that makes scores lie, and a </w:t>
+      </w:r>
+      <w:hyperlink w:history="1" r:id="rIdlpdn58e9rko1yd_lbqght">
         <w:r>
           <w:rPr>
             <w:rStyle w:val="Hyperlink"/>
@@ -173,7 +173,7 @@
           <w:sz w:val="24"/>
           <w:szCs w:val="24"/>
         </w:rPr>
-        <w:t xml:space="preserve"> you can use while you edit.</w:t>
+        <w:t xml:space="preserve"> to use while you edit.</w:t>
       </w:r>
     </w:p>
     <w:p>
@@ -204,23 +204,9 @@
           <w:sz w:val="24"/>
           <w:szCs w:val="24"/>
         </w:rPr>
-        <w:t xml:space="preserve">A good readability score for most blogs is 60–70 on the Flesch Reading Ease scale, which matches a US grade 8–9 reading level. That band reads like plain English. A general audience can follow it on a phone without re-reading lines.</w:t>
-      </w:r>
-    </w:p>
-    <w:p>
-      <w:pPr>
-        <w:spacing w:after="160"/>
-      </w:pPr>
-      <w:r>
-        <w:rPr>
-          <w:rFonts w:ascii="Calibri" w:cs="Calibri" w:eastAsia="Calibri" w:hAnsi="Calibri"/>
-          <w:color w:val="333333"/>
-          <w:sz w:val="24"/>
-          <w:szCs w:val="24"/>
-        </w:rPr>
-        <w:t xml:space="preserve">The Flesch Reading Ease formula looks at two things only: average words per sentence and average syllables per word. Higher scores mean easier text. The </w:t>
-      </w:r>
-      <w:hyperlink w:history="1" r:id="rIdjcy55_f8vucfbdfdrfhy8">
+        <w:t xml:space="preserve">A good readability score for most blogs is 60–70 on the Flesch Reading Ease scale, which matches a US grade 8–9 reading level. Microsoft gives the same range in its </w:t>
+      </w:r>
+      <w:hyperlink w:history="1" r:id="rId-ck7ugemyveoycv0yqtbe">
         <w:r>
           <w:rPr>
             <w:rStyle w:val="Hyperlink"/>
@@ -230,7 +216,7 @@
             <w:szCs w:val="24"/>
             <w:u w:val="single"/>
           </w:rPr>
-          <w:t xml:space="preserve">Flesch–Kincaid tests</w:t>
+          <w:t xml:space="preserve">guide to Word's readability statistics</w:t>
         </w:r>
       </w:hyperlink>
       <w:r>
@@ -240,7 +226,43 @@
           <w:sz w:val="24"/>
           <w:szCs w:val="24"/>
         </w:rPr>
-        <w:t xml:space="preserve"> translate the same inputs into a school grade instead.</w:t>
+        <w:t xml:space="preserve">, and suggests a Flesch–Kincaid grade of about 7 to 8 for most documents.</w:t>
+      </w:r>
+    </w:p>
+    <w:p>
+      <w:pPr>
+        <w:spacing w:after="160"/>
+      </w:pPr>
+      <w:r>
+        <w:rPr>
+          <w:rFonts w:ascii="Calibri" w:cs="Calibri" w:eastAsia="Calibri" w:hAnsi="Calibri"/>
+          <w:color w:val="333333"/>
+          <w:sz w:val="24"/>
+          <w:szCs w:val="24"/>
+        </w:rPr>
+        <w:t xml:space="preserve">Flesch Reading Ease uses just two inputs: average words per sentence and average syllables per word. Higher scores mean easier text. The </w:t>
+      </w:r>
+      <w:hyperlink w:history="1" r:id="rIdz_o9qt-e8mjxebfteujhx">
+        <w:r>
+          <w:rPr>
+            <w:rStyle w:val="Hyperlink"/>
+            <w:rFonts w:ascii="Calibri" w:cs="Calibri" w:eastAsia="Calibri" w:hAnsi="Calibri"/>
+            <w:color w:val="0563C1"/>
+            <w:sz w:val="24"/>
+            <w:szCs w:val="24"/>
+            <w:u w:val="single"/>
+          </w:rPr>
+          <w:t xml:space="preserve">Flesch–Kincaid grade level</w:t>
+        </w:r>
+      </w:hyperlink>
+      <w:r>
+        <w:rPr>
+          <w:rFonts w:ascii="Calibri" w:cs="Calibri" w:eastAsia="Calibri" w:hAnsi="Calibri"/>
+          <w:color w:val="333333"/>
+          <w:sz w:val="24"/>
+          <w:szCs w:val="24"/>
+        </w:rPr>
+        <w:t xml:space="preserve"> turns the same inputs into a school grade, where lower is easier.</w:t>
       </w:r>
     </w:p>
     <w:p>
@@ -370,7 +392,7 @@
           <w:sz w:val="24"/>
           <w:szCs w:val="24"/>
         </w:rPr>
-        <w:t xml:space="preserve"> 50–60 is fine, because readers expect terms like "API" or "canonical tag"</w:t>
+        <w:t xml:space="preserve"> 50–60 works, because readers expect terms like "API" or "canonical tag"</w:t>
       </w:r>
     </w:p>
     <w:p>
@@ -390,7 +412,7 @@
           <w:sz w:val="24"/>
           <w:szCs w:val="24"/>
         </w:rPr>
-        <w:t xml:space="preserve">Content for beginners or non-native readers:</w:t>
+        <w:t xml:space="preserve">Beginners or readers with English as a second language:</w:t>
       </w:r>
       <w:r>
         <w:rPr>
@@ -415,7 +437,7 @@
         </w:rPr>
         <w:t xml:space="preserve">Hemingway Editor </w:t>
       </w:r>
-      <w:hyperlink w:history="1" r:id="rIdqdby0vwv5vg7k8bmcot9q">
+      <w:hyperlink w:history="1" r:id="rIdbsu3xwd0i6iqwglxsr9-u">
         <w:r>
           <w:rPr>
             <w:rStyle w:val="Hyperlink"/>
@@ -425,7 +447,7 @@
             <w:szCs w:val="24"/>
             <w:u w:val="single"/>
           </w:rPr>
-          <w:t xml:space="preserve">states that over half of US adults read at an 8th-grade level</w:t>
+          <w:t xml:space="preserve">notes that over half of US adults read at an 8th-grade level</w:t>
         </w:r>
       </w:hyperlink>
       <w:r>
@@ -435,7 +457,7 @@
           <w:sz w:val="24"/>
           <w:szCs w:val="24"/>
         </w:rPr>
-        <w:t xml:space="preserve">. Writing above that level shrinks your audience before they reach your second paragraph.</w:t>
+        <w:t xml:space="preserve">. Write above that level and you shrink your audience before the second paragraph.</w:t>
       </w:r>
     </w:p>
     <w:p>
@@ -468,7 +490,7 @@
         </w:rPr>
         <w:t xml:space="preserve">No. Readability score is not a direct Google ranking factor. Google's John Mueller </w:t>
       </w:r>
-      <w:hyperlink w:history="1" r:id="rId13tcz4gycxswdjb8nw9rt">
+      <w:hyperlink w:history="1" r:id="rIdtuv7zabzcw5nfo0bqihcw">
         <w:r>
           <w:rPr>
             <w:rStyle w:val="Hyperlink"/>
@@ -502,9 +524,9 @@
           <w:sz w:val="24"/>
           <w:szCs w:val="24"/>
         </w:rPr>
-        <w:t xml:space="preserve">The data backs him up. Portent </w:t>
-      </w:r>
-      <w:hyperlink w:history="1" r:id="rIdaatwvuce3b6e7wa_tcmc2">
+        <w:t xml:space="preserve">The data agrees. Portent </w:t>
+      </w:r>
+      <w:hyperlink w:history="1" r:id="rId3qfio9b-5uo5ulzjnstma">
         <w:r>
           <w:rPr>
             <w:rStyle w:val="Hyperlink"/>
@@ -524,9 +546,9 @@
           <w:sz w:val="24"/>
           <w:szCs w:val="24"/>
         </w:rPr>
-        <w:t xml:space="preserve"> and found no link between reading level and ranking position. The average Flesch score of the top 30 results sat between 51.8 and 53.1. Originality.ai reached the same conclusion in a </w:t>
-      </w:r>
-      <w:hyperlink w:history="1" r:id="rId0lae1d0cwtgmh4xtre-ke">
+        <w:t xml:space="preserve"> and found no link between reading level and ranking position. The mean Flesch score of the top 30 results sat between 51.8 and 53.1. Originality.ai reached the same conclusion in a </w:t>
+      </w:r>
+      <w:hyperlink w:history="1" r:id="rIdivbfexbwbznpn22fufdqn">
         <w:r>
           <w:rPr>
             <w:rStyle w:val="Hyperlink"/>
@@ -546,21 +568,21 @@
           <w:sz w:val="24"/>
           <w:szCs w:val="24"/>
         </w:rPr>
-        <w:t xml:space="preserve">: pages that rank have similar readability, but the score itself does not predict position.</w:t>
-      </w:r>
-    </w:p>
-    <w:p>
-      <w:pPr>
-        <w:spacing w:after="160"/>
-      </w:pPr>
-      <w:r>
-        <w:rPr>
-          <w:rFonts w:ascii="Calibri" w:cs="Calibri" w:eastAsia="Calibri" w:hAnsi="Calibri"/>
-          <w:color w:val="333333"/>
-          <w:sz w:val="24"/>
-          <w:szCs w:val="24"/>
-        </w:rPr>
-        <w:t xml:space="preserve">So why bother? Because readers decide whether your page did its job. That signal matters to Google even if the formula doesn't.</w:t>
+        <w:t xml:space="preserve">: ranking pages have similar readability, but the score does not predict position.</w:t>
+      </w:r>
+    </w:p>
+    <w:p>
+      <w:pPr>
+        <w:spacing w:after="160"/>
+      </w:pPr>
+      <w:r>
+        <w:rPr>
+          <w:rFonts w:ascii="Calibri" w:cs="Calibri" w:eastAsia="Calibri" w:hAnsi="Calibri"/>
+          <w:color w:val="333333"/>
+          <w:sz w:val="24"/>
+          <w:szCs w:val="24"/>
+        </w:rPr>
+        <w:t xml:space="preserve">So why bother? Because readers decide whether your page did its job, and that shows up in how they behave.</w:t>
       </w:r>
     </w:p>
     <w:p>
@@ -591,7 +613,7 @@
         </w:rPr>
         <w:t xml:space="preserve"> Nielsen Norman Group found that </w:t>
       </w:r>
-      <w:hyperlink w:history="1" r:id="rIdces0kwv87kdch51rktxvq">
+      <w:hyperlink w:history="1" r:id="rIdrwa1h4vam3kbvyoxcadgt">
         <w:r>
           <w:rPr>
             <w:rStyle w:val="Hyperlink"/>
@@ -642,7 +664,7 @@
         </w:rPr>
         <w:t xml:space="preserve"> Portent's </w:t>
       </w:r>
-      <w:hyperlink w:history="1" r:id="rIdepyslk1m2atknjeazhd80">
+      <w:hyperlink w:history="1" r:id="rIdh0ruiber1i1klqlct8j5w">
         <w:r>
           <w:rPr>
             <w:rStyle w:val="Hyperlink"/>
@@ -676,7 +698,7 @@
           <w:sz w:val="24"/>
           <w:szCs w:val="24"/>
         </w:rPr>
-        <w:t xml:space="preserve">Treat the score as a diagnostic, not a target Google checks. It points to the sentences that make people leave.</w:t>
+        <w:t xml:space="preserve">Treat the score as a diagnostic, not something Google grades. It points you to the sentences that make people leave.</w:t>
       </w:r>
     </w:p>
     <w:p>
@@ -707,7 +729,7 @@
           <w:sz w:val="24"/>
           <w:szCs w:val="24"/>
         </w:rPr>
-        <w:t xml:space="preserve">I took a paragraph written in the style I see in most raw AI drafts and unedited agency copy: long, abstract and packed with filler. I scored it in our checker, edited it in five passes, then scored it again. Same facts, same length within 30 words.</w:t>
+        <w:t xml:space="preserve">I took a paragraph in the style I see in most raw AI drafts and unedited agency copy: long, abstract and full of filler. I scored it in our checker, edited it in five passes, and scored it again.</w:t>
       </w:r>
     </w:p>
     <w:p>
@@ -1187,6 +1209,56 @@
                 <w:sz w:val="24"/>
                 <w:szCs w:val="24"/>
               </w:rPr>
+              <w:t xml:space="preserve">Average syllables per word</w:t>
+            </w:r>
+          </w:p>
+        </w:tc>
+        <w:tc>
+          <w:tcPr>
+            <w:tcW w:type="dxa" w:w="1800"/>
+          </w:tcPr>
+          <w:p>
+            <w:r>
+              <w:rPr>
+                <w:rFonts w:ascii="Calibri" w:cs="Calibri" w:eastAsia="Calibri" w:hAnsi="Calibri"/>
+                <w:color w:val="333333"/>
+                <w:sz w:val="24"/>
+                <w:szCs w:val="24"/>
+              </w:rPr>
+              <w:t xml:space="preserve">2.22</w:t>
+            </w:r>
+          </w:p>
+        </w:tc>
+        <w:tc>
+          <w:tcPr>
+            <w:tcW w:type="dxa" w:w="1800"/>
+          </w:tcPr>
+          <w:p>
+            <w:r>
+              <w:rPr>
+                <w:rFonts w:ascii="Calibri" w:cs="Calibri" w:eastAsia="Calibri" w:hAnsi="Calibri"/>
+                <w:color w:val="333333"/>
+                <w:sz w:val="24"/>
+                <w:szCs w:val="24"/>
+              </w:rPr>
+              <w:t xml:space="preserve">1.35</w:t>
+            </w:r>
+          </w:p>
+        </w:tc>
+      </w:tr>
+      <w:tr>
+        <w:tc>
+          <w:tcPr>
+            <w:tcW w:type="dxa" w:w="1800"/>
+          </w:tcPr>
+          <w:p>
+            <w:r>
+              <w:rPr>
+                <w:rFonts w:ascii="Calibri" w:cs="Calibri" w:eastAsia="Calibri" w:hAnsi="Calibri"/>
+                <w:color w:val="333333"/>
+                <w:sz w:val="24"/>
+                <w:szCs w:val="24"/>
+              </w:rPr>
               <w:t xml:space="preserve">Sentences over 20 words</w:t>
             </w:r>
           </w:p>
@@ -1337,7 +1409,21 @@
           <w:sz w:val="24"/>
           <w:szCs w:val="24"/>
         </w:rPr>
-        <w:t xml:space="preserve">Two things surprised me. First, I cut 32 words and lost zero information. Every fact from the original still sits in the rewrite: keywords, site health, content quality, how Google judges trust, schema, page speed, internal links and the cost of skipping them. Second, the grade level dropped by 17 points mainly from sentence length, not vocabulary. Splitting four sentences into seven did more than any word swap.</w:t>
+        <w:t xml:space="preserve">Two results surprised me. First, I cut 32 words and lost nothing. Keywords, site health, content quality, how Google judges trust, schema, page speed, internal links and the cost of skipping them all survived the rewrite.</w:t>
+      </w:r>
+    </w:p>
+    <w:p>
+      <w:pPr>
+        <w:spacing w:after="160"/>
+      </w:pPr>
+      <w:r>
+        <w:rPr>
+          <w:rFonts w:ascii="Calibri" w:cs="Calibri" w:eastAsia="Calibri" w:hAnsi="Calibri"/>
+          <w:color w:val="333333"/>
+          <w:sz w:val="24"/>
+          <w:szCs w:val="24"/>
+        </w:rPr>
+        <w:t xml:space="preserve">Second, word choice mattered more than I expected. When I ran the Flesch–Kincaid maths on the 17-grade drop, about 10 grades came from shorter words and about 7 from shorter sentences. Splitting sentences is the fastest fix, but swapping words like "multifaceted" and "comprehensive" did the heavier lifting.</w:t>
       </w:r>
     </w:p>
     <w:p>
@@ -1368,7 +1454,7 @@
           <w:sz w:val="24"/>
           <w:szCs w:val="24"/>
         </w:rPr>
-        <w:t xml:space="preserve">Edit in five passes, in this order, and rescore after passes 3 and 5. Doing them out of order wastes time, because splitting sentences often removes the hard words for you.</w:t>
+        <w:t xml:space="preserve">Edit in five passes, in this order, and rescore after passes 3 and 5. The order matters: splitting sentences first often removes hard words along the way, so you swap fewer of them later.</w:t>
       </w:r>
     </w:p>
     <w:p>
@@ -1457,7 +1543,7 @@
           <w:sz w:val="24"/>
           <w:szCs w:val="24"/>
         </w:rPr>
-        <w:t xml:space="preserve">Paste the whole post into a checker and note three numbers: Flesch score, grade level and the share of sentences over 20 words. The last number tells you more than the first two. In my competitor test, the two articles with the most long sentences (StanzaGo at 18% and Readable at 20%) had the most red highlights, even though Readable's overall score passed. A good average can hide a handful of monsters.</w:t>
+        <w:t xml:space="preserve">Paste the whole post into a checker and note three numbers: Flesch score, grade level and the share of sentences over 20 words. That last number tells you the most. In my competitor test, Readable's guide passed 60 overall yet had 20% of its sentences over 20 words. A good average can hide a handful of monsters.</w:t>
       </w:r>
     </w:p>
     <w:p>
@@ -1502,9 +1588,9 @@
           <w:sz w:val="24"/>
           <w:szCs w:val="24"/>
         </w:rPr>
-        <w:t xml:space="preserve">Don't turn every sentence into five words, though. Mix short punches with medium sentences of 15–20 words. Readers feel rhythm, and so do AI detectors, which I covered in </w:t>
-      </w:r>
-      <w:hyperlink w:history="1" r:id="rIdtljgh5xkha2nah2gtasij">
+        <w:t xml:space="preserve">Don't chop everything into five-word lines, though. Mix short sentences with medium ones of 15–20 words so the text keeps a natural rhythm. My guide on </w:t>
+      </w:r>
+      <w:hyperlink w:history="1" r:id="rId6mhelqcreioaph0u0rvlk">
         <w:r>
           <w:rPr>
             <w:rStyle w:val="Hyperlink"/>
@@ -1524,7 +1610,7 @@
           <w:sz w:val="24"/>
           <w:szCs w:val="24"/>
         </w:rPr>
-        <w:t xml:space="preserve">.</w:t>
+        <w:t xml:space="preserve"> covers why that variety matters for AI drafts.</w:t>
       </w:r>
     </w:p>
     <w:p>
@@ -1899,7 +1985,7 @@
           <w:sz w:val="24"/>
           <w:szCs w:val="24"/>
         </w:rPr>
-        <w:t xml:space="preserve">Keep a technical term when your reader needs it. "Schema markup" stayed in my rewrite because an SEO reader searches for that exact phrase. Explain it once, then move on.</w:t>
+        <w:t xml:space="preserve">Keep a technical term when your reader needs it. "Schema markup" stayed in my rewrite because SEO readers search for that phrase. Explain it once, then move on.</w:t>
       </w:r>
     </w:p>
     <w:p>
@@ -1935,6 +2021,20 @@
     </w:p>
     <w:p>
       <w:pPr>
+        <w:spacing w:after="160"/>
+      </w:pPr>
+      <w:r>
+        <w:rPr>
+          <w:rFonts w:ascii="Calibri" w:cs="Calibri" w:eastAsia="Calibri" w:hAnsi="Calibri"/>
+          <w:color w:val="333333"/>
+          <w:sz w:val="24"/>
+          <w:szCs w:val="24"/>
+        </w:rPr>
+        <w:t xml:space="preserve">While you are in each sentence, write to one reader. "You" and "I" read faster than "users" and "the organisation", and they turn a lecture into a conversation.</w:t>
+      </w:r>
+    </w:p>
+    <w:p>
+      <w:pPr>
         <w:pStyle w:val="Heading3"/>
         <w:spacing w:after="80" w:before="200"/>
       </w:pPr>
@@ -1961,21 +2061,205 @@
           <w:sz w:val="24"/>
           <w:szCs w:val="24"/>
         </w:rPr>
-        <w:t xml:space="preserve">Formulas can't hear. If you run out of breath or lose your place, the sentence needs work, whatever the score says. This pass also catches the problem the next section covers.</w:t>
-      </w:r>
-    </w:p>
-    <w:p>
-      <w:pPr>
-        <w:spacing w:after="160"/>
-      </w:pPr>
-      <w:r>
-        <w:rPr>
-          <w:rFonts w:ascii="Calibri" w:cs="Calibri" w:eastAsia="Calibri" w:hAnsi="Calibri"/>
-          <w:color w:val="333333"/>
-          <w:sz w:val="24"/>
-          <w:szCs w:val="24"/>
-        </w:rPr>
-        <w:t xml:space="preserve">Then fix the layout. Short paragraphs of two to four sentences, a descriptive subheading every 250–300 words, and lists for any three or more parallel items. None of these change your Flesch score, but they are what the 79% of scanners actually see.</w:t>
+        <w:t xml:space="preserve">Formulas can't hear. If you run out of breath or lose your place, rewrite the sentence, whatever the score says. This pass also catches over-simplified lines, a problem covered further down.</w:t>
+      </w:r>
+    </w:p>
+    <w:p>
+      <w:pPr>
+        <w:pStyle w:val="Heading3"/>
+        <w:spacing w:after="80" w:before="200"/>
+      </w:pPr>
+      <w:r>
+        <w:rPr>
+          <w:rFonts w:ascii="Calibri" w:cs="Calibri" w:eastAsia="Calibri" w:hAnsi="Calibri"/>
+          <w:b/>
+          <w:bCs/>
+          <w:color w:val="333333"/>
+          <w:sz w:val="28"/>
+          <w:szCs w:val="28"/>
+        </w:rPr>
+        <w:t xml:space="preserve">Then fix the layout for skimmers and phones</w:t>
+      </w:r>
+    </w:p>
+    <w:p>
+      <w:pPr>
+        <w:spacing w:after="160"/>
+      </w:pPr>
+      <w:r>
+        <w:rPr>
+          <w:rFonts w:ascii="Calibri" w:cs="Calibri" w:eastAsia="Calibri" w:hAnsi="Calibri"/>
+          <w:color w:val="333333"/>
+          <w:sz w:val="24"/>
+          <w:szCs w:val="24"/>
+        </w:rPr>
+        <w:t xml:space="preserve">Layout doesn't change your Flesch score, but it decides whether the 79% who scan find what they came for:</w:t>
+      </w:r>
+    </w:p>
+    <w:p>
+      <w:pPr>
+        <w:pStyle w:val="ListParagraph"/>
+        <w:numPr>
+          <w:ilvl w:val="0"/>
+          <w:numId w:val="1"/>
+        </w:numPr>
+      </w:pPr>
+      <w:r>
+        <w:rPr>
+          <w:rFonts w:ascii="Calibri" w:cs="Calibri" w:eastAsia="Calibri" w:hAnsi="Calibri"/>
+          <w:b/>
+          <w:bCs/>
+          <w:color w:val="333333"/>
+          <w:sz w:val="24"/>
+          <w:szCs w:val="24"/>
+        </w:rPr>
+        <w:t xml:space="preserve">Paragraphs of 2–4 sentences.</w:t>
+      </w:r>
+      <w:r>
+        <w:rPr>
+          <w:rFonts w:ascii="Calibri" w:cs="Calibri" w:eastAsia="Calibri" w:hAnsi="Calibri"/>
+          <w:color w:val="333333"/>
+          <w:sz w:val="24"/>
+          <w:szCs w:val="24"/>
+        </w:rPr>
+        <w:t xml:space="preserve"> A four-line paragraph on a laptop can fill a whole phone screen.</w:t>
+      </w:r>
+    </w:p>
+    <w:p>
+      <w:pPr>
+        <w:pStyle w:val="ListParagraph"/>
+        <w:numPr>
+          <w:ilvl w:val="0"/>
+          <w:numId w:val="1"/>
+        </w:numPr>
+      </w:pPr>
+      <w:r>
+        <w:rPr>
+          <w:rFonts w:ascii="Calibri" w:cs="Calibri" w:eastAsia="Calibri" w:hAnsi="Calibri"/>
+          <w:b/>
+          <w:bCs/>
+          <w:color w:val="333333"/>
+          <w:sz w:val="24"/>
+          <w:szCs w:val="24"/>
+        </w:rPr>
+        <w:t xml:space="preserve">A descriptive subheading every 250–300 words.</w:t>
+      </w:r>
+      <w:r>
+        <w:rPr>
+          <w:rFonts w:ascii="Calibri" w:cs="Calibri" w:eastAsia="Calibri" w:hAnsi="Calibri"/>
+          <w:color w:val="333333"/>
+          <w:sz w:val="24"/>
+          <w:szCs w:val="24"/>
+        </w:rPr>
+        <w:t xml:space="preserve"> Write it as a question or an answer, not a label like "Overview".</w:t>
+      </w:r>
+    </w:p>
+    <w:p>
+      <w:pPr>
+        <w:pStyle w:val="ListParagraph"/>
+        <w:numPr>
+          <w:ilvl w:val="0"/>
+          <w:numId w:val="1"/>
+        </w:numPr>
+      </w:pPr>
+      <w:r>
+        <w:rPr>
+          <w:rFonts w:ascii="Calibri" w:cs="Calibri" w:eastAsia="Calibri" w:hAnsi="Calibri"/>
+          <w:b/>
+          <w:bCs/>
+          <w:color w:val="333333"/>
+          <w:sz w:val="24"/>
+          <w:szCs w:val="24"/>
+        </w:rPr>
+        <w:t xml:space="preserve">Lists for three or more parallel items</w:t>
+      </w:r>
+      <w:r>
+        <w:rPr>
+          <w:rFonts w:ascii="Calibri" w:cs="Calibri" w:eastAsia="Calibri" w:hAnsi="Calibri"/>
+          <w:color w:val="333333"/>
+          <w:sz w:val="24"/>
+          <w:szCs w:val="24"/>
+        </w:rPr>
+        <w:t xml:space="preserve">, and bold for the one phrase a skimmer must not miss.</w:t>
+      </w:r>
+    </w:p>
+    <w:p>
+      <w:pPr>
+        <w:pStyle w:val="ListParagraph"/>
+        <w:numPr>
+          <w:ilvl w:val="0"/>
+          <w:numId w:val="1"/>
+        </w:numPr>
+      </w:pPr>
+      <w:r>
+        <w:rPr>
+          <w:rFonts w:ascii="Calibri" w:cs="Calibri" w:eastAsia="Calibri" w:hAnsi="Calibri"/>
+          <w:b/>
+          <w:bCs/>
+          <w:color w:val="333333"/>
+          <w:sz w:val="24"/>
+          <w:szCs w:val="24"/>
+        </w:rPr>
+        <w:t xml:space="preserve">Transition words</w:t>
+      </w:r>
+      <w:r>
+        <w:rPr>
+          <w:rFonts w:ascii="Calibri" w:cs="Calibri" w:eastAsia="Calibri" w:hAnsi="Calibri"/>
+          <w:color w:val="333333"/>
+          <w:sz w:val="24"/>
+          <w:szCs w:val="24"/>
+        </w:rPr>
+        <w:t xml:space="preserve"> such as "so", "but", "because" and "for example". Yoast </w:t>
+      </w:r>
+      <w:hyperlink w:history="1" r:id="rIdw1odf6dw25giego5gb-bz">
+        <w:r>
+          <w:rPr>
+            <w:rStyle w:val="Hyperlink"/>
+            <w:rFonts w:ascii="Calibri" w:cs="Calibri" w:eastAsia="Calibri" w:hAnsi="Calibri"/>
+            <w:color w:val="0563C1"/>
+            <w:sz w:val="24"/>
+            <w:szCs w:val="24"/>
+            <w:u w:val="single"/>
+          </w:rPr>
+          <w:t xml:space="preserve">turns its check green when at least 30% of sentences contain one</w:t>
+        </w:r>
+      </w:hyperlink>
+      <w:r>
+        <w:rPr>
+          <w:rFonts w:ascii="Calibri" w:cs="Calibri" w:eastAsia="Calibri" w:hAnsi="Calibri"/>
+          <w:color w:val="333333"/>
+          <w:sz w:val="24"/>
+          <w:szCs w:val="24"/>
+        </w:rPr>
+        <w:t xml:space="preserve">. They link ideas so short sentences don't feel choppy.</w:t>
+      </w:r>
+    </w:p>
+    <w:p>
+      <w:pPr>
+        <w:pStyle w:val="ListParagraph"/>
+        <w:numPr>
+          <w:ilvl w:val="0"/>
+          <w:numId w:val="1"/>
+        </w:numPr>
+      </w:pPr>
+      <w:r>
+        <w:rPr>
+          <w:rFonts w:ascii="Calibri" w:cs="Calibri" w:eastAsia="Calibri" w:hAnsi="Calibri"/>
+          <w:b/>
+          <w:bCs/>
+          <w:color w:val="333333"/>
+          <w:sz w:val="24"/>
+          <w:szCs w:val="24"/>
+        </w:rPr>
+        <w:t xml:space="preserve">A table, image or screenshot</w:t>
+      </w:r>
+      <w:r>
+        <w:rPr>
+          <w:rFonts w:ascii="Calibri" w:cs="Calibri" w:eastAsia="Calibri" w:hAnsi="Calibri"/>
+          <w:color w:val="333333"/>
+          <w:sz w:val="24"/>
+          <w:szCs w:val="24"/>
+        </w:rPr>
+        <w:t xml:space="preserve"> wherever you'd otherwise describe numbers in a paragraph.</w:t>
       </w:r>
     </w:p>
     <w:p>
@@ -1992,6 +2276,85 @@
           <w:sz w:val="36"/>
           <w:szCs w:val="36"/>
         </w:rPr>
+        <w:t xml:space="preserve">Can AI tools improve your readability score?</w:t>
+      </w:r>
+    </w:p>
+    <w:p>
+      <w:pPr>
+        <w:spacing w:after="160"/>
+      </w:pPr>
+      <w:r>
+        <w:rPr>
+          <w:rFonts w:ascii="Calibri" w:cs="Calibri" w:eastAsia="Calibri" w:hAnsi="Calibri"/>
+          <w:color w:val="333333"/>
+          <w:sz w:val="24"/>
+          <w:szCs w:val="24"/>
+        </w:rPr>
+        <w:t xml:space="preserve">Yes, if you give them strict rules and check the result. Claude and ChatGPT can split sentences and swap long words in seconds. The risk is that they cut facts to reach an easy score, which is the trap in the next section.</w:t>
+      </w:r>
+    </w:p>
+    <w:p>
+      <w:pPr>
+        <w:spacing w:after="160"/>
+      </w:pPr>
+      <w:r>
+        <w:rPr>
+          <w:rFonts w:ascii="Calibri" w:cs="Calibri" w:eastAsia="Calibri" w:hAnsi="Calibri"/>
+          <w:color w:val="333333"/>
+          <w:sz w:val="24"/>
+          <w:szCs w:val="24"/>
+        </w:rPr>
+        <w:t xml:space="preserve">Try a prompt like this:</w:t>
+      </w:r>
+    </w:p>
+    <w:p>
+      <w:pPr>
+        <w:pBdr>
+          <w:left w:val="single" w:color="7C3AED" w:sz="18" w:space="8"/>
+        </w:pBdr>
+        <w:shd w:fill="F0ECFF" w:val="clear"/>
+        <w:spacing w:after="160"/>
+      </w:pPr>
+      <w:r>
+        <w:rPr>
+          <w:rFonts w:ascii="Calibri" w:cs="Calibri" w:eastAsia="Calibri" w:hAnsi="Calibri"/>
+          <w:i/>
+          <w:iCs/>
+          <w:color w:val="333333"/>
+          <w:sz w:val="24"/>
+          <w:szCs w:val="24"/>
+        </w:rPr>
+        <w:t xml:space="preserve">"Rewrite the text below for a Flesch Reading Ease of 60–70. Keep every fact, number and name. Keep these terms unchanged: [your keywords and technical terms]. Use active voice. Keep average sentence length at 14–18 words and vary it. Don't add new claims. After the rewrite, list any fact you removed."</w:t>
+      </w:r>
+    </w:p>
+    <w:p>
+      <w:pPr>
+        <w:spacing w:after="160"/>
+      </w:pPr>
+      <w:r>
+        <w:rPr>
+          <w:rFonts w:ascii="Calibri" w:cs="Calibri" w:eastAsia="Calibri" w:hAnsi="Calibri"/>
+          <w:color w:val="333333"/>
+          <w:sz w:val="24"/>
+          <w:szCs w:val="24"/>
+        </w:rPr>
+        <w:t xml:space="preserve">The last line is your safety net. Then paste the output into the checker and compare it with your original, sentence by sentence. If you work in WordPress, AIOSEO also has a built-in AI assistant for readability edits.</w:t>
+      </w:r>
+    </w:p>
+    <w:p>
+      <w:pPr>
+        <w:pStyle w:val="Heading2"/>
+        <w:spacing w:after="120" w:before="300"/>
+      </w:pPr>
+      <w:r>
+        <w:rPr>
+          <w:rFonts w:ascii="Calibri" w:cs="Calibri" w:eastAsia="Calibri" w:hAnsi="Calibri"/>
+          <w:b/>
+          <w:bCs/>
+          <w:color w:val="7C3AED"/>
+          <w:sz w:val="36"/>
+          <w:szCs w:val="36"/>
+        </w:rPr>
         <w:t xml:space="preserve">Can you get a readability score that is too high?</w:t>
       </w:r>
     </w:p>
@@ -2006,7 +2369,7 @@
           <w:sz w:val="24"/>
           <w:szCs w:val="24"/>
         </w:rPr>
-        <w:t xml:space="preserve">Yes. A score above 85 on an informational post usually means you cut detail, not clutter. Readability formulas only count sentence and word length, so choppy fragments score brilliantly while reading badly.</w:t>
+        <w:t xml:space="preserve">Yes. A score above 85 on an informational post usually means you cut detail, not clutter. Readability formulas only count sentence length and syllables, so choppy fragments score brilliantly while reading badly.</w:t>
       </w:r>
     </w:p>
     <w:p>
@@ -2092,9 +2455,9 @@
           <w:sz w:val="24"/>
           <w:szCs w:val="24"/>
         </w:rPr>
-        <w:t xml:space="preserve">That version tells the reader nothing useful. It dropped from 91 words to 35 and lost every explanation of why each factor matters. Yoast gave the same reason when it </w:t>
-      </w:r>
-      <w:hyperlink w:history="1" r:id="rId9a_r8xwf_ifrbfsmlcoax">
+        <w:t xml:space="preserve">That version tells the reader nothing. It dropped from 91 words to 35 and lost every explanation of why each factor matters. Yoast cited the same weakness when it </w:t>
+      </w:r>
+      <w:hyperlink w:history="1" r:id="rIdb7eh-3jnbtstewwwqgkby">
         <w:r>
           <w:rPr>
             <w:rStyle w:val="Hyperlink"/>
@@ -2128,7 +2491,7 @@
           <w:sz w:val="24"/>
           <w:szCs w:val="24"/>
         </w:rPr>
-        <w:t xml:space="preserve">My rule: stop editing for the score once you land in 60–70. After that, edit for meaning.</w:t>
+        <w:t xml:space="preserve">My rule: once you land in 60–70, stop editing for the number and edit for meaning.</w:t>
       </w:r>
     </w:p>
     <w:p>
@@ -2159,7 +2522,7 @@
           <w:sz w:val="24"/>
           <w:szCs w:val="24"/>
         </w:rPr>
-        <w:t xml:space="preserve">I scored the main body text of 11 ranking guides for "how to improve readability score" in September 2026. Only three reached 60 or above. The median was 55.7, a "fairly difficult" rating.</w:t>
+        <w:t xml:space="preserve">I scored the main body text of 11 ranking guides for "how to improve readability score" in September 2026. Only three reached 60. The median was 55.7, a "fairly difficult" rating.</w:t>
       </w:r>
     </w:p>
     <w:p>
@@ -3251,7 +3614,21 @@
           <w:sz w:val="24"/>
           <w:szCs w:val="24"/>
         </w:rPr>
-        <w:t xml:space="preserve">Two lessons came out of this. First, pages can rank at 53–59, which matches Portent's finding that ranking pages cluster in the low 50s. Nobody needs a perfect score to rank. Second, many of these articles had short average sentences (10–14 words) and still scored in the 50s. The drag came from vocabulary: words like "readability", "optimisation" and "comprehension" carry four or five syllables each. On a topic full of long terms, 55–60 is a realistic ceiling, and that is fine.</w:t>
+        <w:t xml:space="preserve">Two lessons came out of this. First, pages rank comfortably at 53–59, which fits Portent's finding that ranking pages cluster in the low 50s. You don't need a perfect score to rank.</w:t>
+      </w:r>
+    </w:p>
+    <w:p>
+      <w:pPr>
+        <w:spacing w:after="160"/>
+      </w:pPr>
+      <w:r>
+        <w:rPr>
+          <w:rFonts w:ascii="Calibri" w:cs="Calibri" w:eastAsia="Calibri" w:hAnsi="Calibri"/>
+          <w:color w:val="333333"/>
+          <w:sz w:val="24"/>
+          <w:szCs w:val="24"/>
+        </w:rPr>
+        <w:t xml:space="preserve">Second, most of these articles already had short sentences, averaging 10–14 words, and still scored in the 50s. The drag came from vocabulary. Words like "readability", "optimisation" and "comprehension" carry four or five syllables each. On a topic full of long terms, 55–60 is a realistic ceiling, and that's fine.</w:t>
       </w:r>
     </w:p>
     <w:p>
@@ -3296,7 +3673,7 @@
           <w:sz w:val="24"/>
           <w:szCs w:val="24"/>
         </w:rPr>
-        <w:t xml:space="preserve">The best free readability checker depends on where you write. I use three at different stages:</w:t>
+        <w:t xml:space="preserve">The best free readability checker depends on where you write. Each of these suits a different stage:</w:t>
       </w:r>
     </w:p>
     <w:p>
@@ -3307,7 +3684,7 @@
           <w:numId w:val="1"/>
         </w:numPr>
       </w:pPr>
-      <w:hyperlink w:history="1" r:id="rIdpip5hlm9n7ersfjziheuy">
+      <w:hyperlink w:history="1" r:id="rIdcdyeov_zvzkwngphuheyd">
         <w:r>
           <w:rPr>
             <w:rStyle w:val="Hyperlink"/>
@@ -3327,7 +3704,7 @@
           <w:sz w:val="24"/>
           <w:szCs w:val="24"/>
         </w:rPr>
-        <w:t xml:space="preserve"> – free, no sign-up, runs in your browser. Shows Flesch, Flesch–Kincaid, Gunning Fog and ARI together, and highlights sentences over 20 and 30 words plus likely passive voice. I built it for pass 1 and the final rescore.</w:t>
+        <w:t xml:space="preserve"> – free, no sign-up. Shows Flesch, Flesch–Kincaid, Gunning Fog and ARI side by side, and highlights sentences over 20 and 30 words plus likely passive voice. Best for pass 1 and the final rescore.</w:t>
       </w:r>
     </w:p>
     <w:p>
@@ -3338,7 +3715,7 @@
           <w:numId w:val="1"/>
         </w:numPr>
       </w:pPr>
-      <w:hyperlink w:history="1" r:id="rIdfngivhjo-nwp5rlvtmhjd">
+      <w:hyperlink w:history="1" r:id="rIdp46xfmgzbggeweef9ozcl">
         <w:r>
           <w:rPr>
             <w:rStyle w:val="Hyperlink"/>
@@ -3358,7 +3735,7 @@
           <w:sz w:val="24"/>
           <w:szCs w:val="24"/>
         </w:rPr>
-        <w:t xml:space="preserve"> – the free web version colour-codes hard sentences, adverbs and passive voice. Good for pass 2 and pass 4.</w:t>
+        <w:t xml:space="preserve"> – the free web version colour-codes hard sentences, adverbs and passive voice. Best for passes 2 and 4.</w:t>
       </w:r>
     </w:p>
     <w:p>
@@ -3378,16 +3755,45 @@
           <w:sz w:val="24"/>
           <w:szCs w:val="24"/>
         </w:rPr>
-        <w:t xml:space="preserve">Yoast SEO or AIOSEO (WordPress)</w:t>
-      </w:r>
-      <w:r>
-        <w:rPr>
-          <w:rFonts w:ascii="Calibri" w:cs="Calibri" w:eastAsia="Calibri" w:hAnsi="Calibri"/>
-          <w:color w:val="333333"/>
-          <w:sz w:val="24"/>
-          <w:szCs w:val="24"/>
-        </w:rPr>
-        <w:t xml:space="preserve"> – checks sentence length, paragraph length, passive voice, transition words and subheading spacing inside the editor. Useful as a final check before you hit publish.</w:t>
+        <w:t xml:space="preserve">Microsoft Word</w:t>
+      </w:r>
+      <w:r>
+        <w:rPr>
+          <w:rFonts w:ascii="Calibri" w:cs="Calibri" w:eastAsia="Calibri" w:hAnsi="Calibri"/>
+          <w:color w:val="333333"/>
+          <w:sz w:val="24"/>
+          <w:szCs w:val="24"/>
+        </w:rPr>
+        <w:t xml:space="preserve"> – shows Flesch Reading Ease and Flesch–Kincaid grade under Editor &gt; Document stats in Microsoft 365. Handy if you draft in Word.</w:t>
+      </w:r>
+    </w:p>
+    <w:p>
+      <w:pPr>
+        <w:pStyle w:val="ListParagraph"/>
+        <w:numPr>
+          <w:ilvl w:val="0"/>
+          <w:numId w:val="1"/>
+        </w:numPr>
+      </w:pPr>
+      <w:r>
+        <w:rPr>
+          <w:rFonts w:ascii="Calibri" w:cs="Calibri" w:eastAsia="Calibri" w:hAnsi="Calibri"/>
+          <w:b/>
+          <w:bCs/>
+          <w:color w:val="333333"/>
+          <w:sz w:val="24"/>
+          <w:szCs w:val="24"/>
+        </w:rPr>
+        <w:t xml:space="preserve">Yoast SEO, Rank Math or AIOSEO (WordPress)</w:t>
+      </w:r>
+      <w:r>
+        <w:rPr>
+          <w:rFonts w:ascii="Calibri" w:cs="Calibri" w:eastAsia="Calibri" w:hAnsi="Calibri"/>
+          <w:color w:val="333333"/>
+          <w:sz w:val="24"/>
+          <w:szCs w:val="24"/>
+        </w:rPr>
+        <w:t xml:space="preserve"> – check sentence length, paragraph length, passive voice, transition words and subheading spacing inside the editor. A useful last check before publishing.</w:t>
       </w:r>
     </w:p>
     <w:p>
@@ -3435,21 +3841,21 @@
           <w:sz w:val="28"/>
           <w:szCs w:val="28"/>
         </w:rPr>
-        <w:t xml:space="preserve">Is the Flesch–Kincaid grade the same as Flesch Reading Ease?</w:t>
-      </w:r>
-    </w:p>
-    <w:p>
-      <w:pPr>
-        <w:spacing w:after="160"/>
-      </w:pPr>
-      <w:r>
-        <w:rPr>
-          <w:rFonts w:ascii="Calibri" w:cs="Calibri" w:eastAsia="Calibri" w:hAnsi="Calibri"/>
-          <w:color w:val="333333"/>
-          <w:sz w:val="24"/>
-          <w:szCs w:val="24"/>
-        </w:rPr>
-        <w:t xml:space="preserve">No. Both use the same inputs, but Flesch Reading Ease gives a 0–100 score where higher is easier, while Flesch–Kincaid gives a US school grade where lower is easier. A 60–70 Reading Ease roughly equals grade 8–9.</w:t>
+        <w:t xml:space="preserve">What does a US grade level mean for UK readers?</w:t>
+      </w:r>
+    </w:p>
+    <w:p>
+      <w:pPr>
+        <w:spacing w:after="160"/>
+      </w:pPr>
+      <w:r>
+        <w:rPr>
+          <w:rFonts w:ascii="Calibri" w:cs="Calibri" w:eastAsia="Calibri" w:hAnsi="Calibri"/>
+          <w:color w:val="333333"/>
+          <w:sz w:val="24"/>
+          <w:szCs w:val="24"/>
+        </w:rPr>
+        <w:t xml:space="preserve">Add five to the US grade to get the reader's age. Grade 8 means roughly age 13–14, the same as Year 9 in England. So a 60–70 Flesch score suits a typical Year 9 or Year 10 pupil.</w:t>
       </w:r>
     </w:p>
     <w:p>
@@ -3466,21 +3872,43 @@
           <w:sz w:val="28"/>
           <w:szCs w:val="28"/>
         </w:rPr>
-        <w:t xml:space="preserve">Why does my readability score change between tools?</w:t>
-      </w:r>
-    </w:p>
-    <w:p>
-      <w:pPr>
-        <w:spacing w:after="160"/>
-      </w:pPr>
-      <w:r>
-        <w:rPr>
-          <w:rFonts w:ascii="Calibri" w:cs="Calibri" w:eastAsia="Calibri" w:hAnsi="Calibri"/>
-          <w:color w:val="333333"/>
-          <w:sz w:val="24"/>
-          <w:szCs w:val="24"/>
-        </w:rPr>
-        <w:t xml:space="preserve">Each tool counts syllables and splits sentences in its own way. Headings, list items and abbreviations like "e.g." are handled differently, so the same text can score several points apart. Judge progress with one tool only.</w:t>
+        <w:t xml:space="preserve">What is a good Gunning Fog score for a blog?</w:t>
+      </w:r>
+    </w:p>
+    <w:p>
+      <w:pPr>
+        <w:spacing w:after="160"/>
+      </w:pPr>
+      <w:r>
+        <w:rPr>
+          <w:rFonts w:ascii="Calibri" w:cs="Calibri" w:eastAsia="Calibri" w:hAnsi="Calibri"/>
+          <w:color w:val="333333"/>
+          <w:sz w:val="24"/>
+          <w:szCs w:val="24"/>
+        </w:rPr>
+        <w:t xml:space="preserve">Keep it below 12. The Gunning Fog index counts words of three or more syllables, and </w:t>
+      </w:r>
+      <w:hyperlink w:history="1" r:id="rId3j5vwforisjy6wwg1puvu">
+        <w:r>
+          <w:rPr>
+            <w:rStyle w:val="Hyperlink"/>
+            <w:rFonts w:ascii="Calibri" w:cs="Calibri" w:eastAsia="Calibri" w:hAnsi="Calibri"/>
+            <w:color w:val="0563C1"/>
+            <w:sz w:val="24"/>
+            <w:szCs w:val="24"/>
+            <w:u w:val="single"/>
+          </w:rPr>
+          <w:t xml:space="preserve">texts for a wide audience generally need a fog index under 12</w:t>
+        </w:r>
+      </w:hyperlink>
+      <w:r>
+        <w:rPr>
+          <w:rFonts w:ascii="Calibri" w:cs="Calibri" w:eastAsia="Calibri" w:hAnsi="Calibri"/>
+          <w:color w:val="333333"/>
+          <w:sz w:val="24"/>
+          <w:szCs w:val="24"/>
+        </w:rPr>
+        <w:t xml:space="preserve">, with under 8 for near-universal understanding.</w:t>
       </w:r>
     </w:p>
     <w:p>
@@ -3511,7 +3939,7 @@
           <w:sz w:val="24"/>
           <w:szCs w:val="24"/>
         </w:rPr>
-        <w:t xml:space="preserve">Many checkers, including ours, treat each heading or bullet as a short sentence, which pushes the score up. Paste body text only, or check with and without formatting, if you want a fair baseline.</w:t>
+        <w:t xml:space="preserve">Yes. Many checkers, including ours, treat each heading or bullet as a short sentence, which pushes the score up. Paste body text only if you want a fair baseline.</w:t>
       </w:r>
     </w:p>
     <w:p>
@@ -3573,7 +4001,7 @@
           <w:sz w:val="24"/>
           <w:szCs w:val="24"/>
         </w:rPr>
-        <w:t xml:space="preserve">Start with posts that already get impressions in Google Search Console but show short engagement time in GA4. People are finding them and leaving early, so clearer writing has the most room to help there.</w:t>
+        <w:t xml:space="preserve">Start with posts that already get impressions in Google Search Console but show short engagement time in GA4. People find them and leave early, so clearer writing has the most room to help.</w:t>
       </w:r>
     </w:p>
     <w:p>
@@ -3604,7 +4032,7 @@
           <w:sz w:val="24"/>
           <w:szCs w:val="24"/>
         </w:rPr>
-        <w:t xml:space="preserve">No. The checker runs entirely in your browser with JavaScript. Your draft is never uploaded or stored, so it is safe for unpublished client work.</w:t>
+        <w:t xml:space="preserve">No. The checker runs entirely in your browser with JavaScript. Your draft is never uploaded or stored, so it's safe for unpublished client work.</w:t>
       </w:r>
     </w:p>
     <w:p>
@@ -3621,37 +4049,37 @@
           <w:sz w:val="36"/>
           <w:szCs w:val="36"/>
         </w:rPr>
-        <w:t xml:space="preserve">Keep the score in its place</w:t>
-      </w:r>
-    </w:p>
-    <w:p>
-      <w:pPr>
-        <w:spacing w:after="160"/>
-      </w:pPr>
-      <w:r>
-        <w:rPr>
-          <w:rFonts w:ascii="Calibri" w:cs="Calibri" w:eastAsia="Calibri" w:hAnsi="Calibri"/>
-          <w:color w:val="333333"/>
-          <w:sz w:val="24"/>
-          <w:szCs w:val="24"/>
-        </w:rPr>
-        <w:t xml:space="preserve">Improving your blog readability score comes down to shorter sentences, plainer words and active voice. Land in 60–70 and stop there. The score is a flashlight for problem sentences, not a grade Google hands out.</w:t>
-      </w:r>
-    </w:p>
-    <w:p>
-      <w:pPr>
-        <w:spacing w:after="160"/>
-      </w:pPr>
-      <w:r>
-        <w:rPr>
-          <w:rFonts w:ascii="Calibri" w:cs="Calibri" w:eastAsia="Calibri" w:hAnsi="Calibri"/>
-          <w:color w:val="333333"/>
-          <w:sz w:val="24"/>
-          <w:szCs w:val="24"/>
-        </w:rPr>
-        <w:t xml:space="preserve">If you're drafting with AI, run the draft through the checker before you publish. My guide on </w:t>
-      </w:r>
-      <w:hyperlink w:history="1" r:id="rIdsoql03irdyf2a_wltwhs5">
+        <w:t xml:space="preserve">Final thoughts</w:t>
+      </w:r>
+    </w:p>
+    <w:p>
+      <w:pPr>
+        <w:spacing w:after="160"/>
+      </w:pPr>
+      <w:r>
+        <w:rPr>
+          <w:rFonts w:ascii="Calibri" w:cs="Calibri" w:eastAsia="Calibri" w:hAnsi="Calibri"/>
+          <w:color w:val="333333"/>
+          <w:sz w:val="24"/>
+          <w:szCs w:val="24"/>
+        </w:rPr>
+        <w:t xml:space="preserve">Readability scores reward short sentences and short words, and readers do too, up to a point. Use the score to find the sentences that lose people, fix them in five passes, and let meaning win once you're in range.</w:t>
+      </w:r>
+    </w:p>
+    <w:p>
+      <w:pPr>
+        <w:spacing w:after="160"/>
+      </w:pPr>
+      <w:r>
+        <w:rPr>
+          <w:rFonts w:ascii="Calibri" w:cs="Calibri" w:eastAsia="Calibri" w:hAnsi="Calibri"/>
+          <w:color w:val="333333"/>
+          <w:sz w:val="24"/>
+          <w:szCs w:val="24"/>
+        </w:rPr>
+        <w:t xml:space="preserve">Drafting with AI? My guide on </w:t>
+      </w:r>
+      <w:hyperlink w:history="1" r:id="rIdsnhnhilorrtvslawg3svi">
         <w:r>
           <w:rPr>
             <w:rStyle w:val="Hyperlink"/>
@@ -3671,9 +4099,9 @@
           <w:sz w:val="24"/>
           <w:szCs w:val="24"/>
         </w:rPr>
-        <w:t xml:space="preserve"> covers the drafting side, and our </w:t>
-      </w:r>
-      <w:hyperlink w:history="1" r:id="rId4mj8utoepozm-ttbe4nys">
+        <w:t xml:space="preserve"> covers the drafting side, and the </w:t>
+      </w:r>
+      <w:hyperlink w:history="1" r:id="rIde9mepybwkb1mycoqalrc9">
         <w:r>
           <w:rPr>
             <w:rStyle w:val="Hyperlink"/>
@@ -3683,7 +4111,7 @@
             <w:szCs w:val="24"/>
             <w:u w:val="single"/>
           </w:rPr>
-          <w:t xml:space="preserve">word count guide</w:t>
+          <w:t xml:space="preserve">blog post word count guide</w:t>
         </w:r>
       </w:hyperlink>
       <w:r>

</xml_diff>